<commit_message>
idek anymore man im tired of commiting these dumb reports. i just added some missing text back
</commit_message>
<xml_diff>
--- a/Individuals/final_reports/P2518507-HannahHow-CA2_Individual.docx
+++ b/Individuals/final_reports/P2518507-HannahHow-CA2_Individual.docx
@@ -1142,7 +1142,7 @@
                                   <w:pStyle w:val="NoSpacing"/>
                                   <w:jc w:val="right"/>
                                   <w:rPr>
-                                    <w:color w:val="FFFFFF" w:themeColor="background1"/>
+                                    <w:color w:val="1C1C1C"/>
                                     <w:sz w:val="28"/>
                                     <w:szCs w:val="28"/>
                                   </w:rPr>
@@ -1189,7 +1189,7 @@
                             <w:pStyle w:val="NoSpacing"/>
                             <w:jc w:val="right"/>
                             <w:rPr>
-                              <w:color w:val="FFFFFF" w:themeColor="background1"/>
+                              <w:color w:val="1C1C1C"/>
                               <w:sz w:val="28"/>
                               <w:szCs w:val="28"/>
                             </w:rPr>
@@ -1830,7 +1830,7 @@
               <w:rPr>
                 <w:rFonts w:ascii="Carlito" w:eastAsia="Carlito" w:hAnsi="Carlito"/>
                 <w:b/>
-                <w:color w:val="FFFFFF"/>
+                <w:color w:val="1C1C1C"/>
                 <w:sz w:val="18"/>
               </w:rPr>
               <w:t>Collection</w:t>
@@ -1863,7 +1863,7 @@
               <w:rPr>
                 <w:rFonts w:ascii="Carlito" w:eastAsia="Carlito" w:hAnsi="Carlito"/>
                 <w:b/>
-                <w:color w:val="FFFFFF"/>
+                <w:color w:val="1C1C1C"/>
                 <w:sz w:val="18"/>
               </w:rPr>
               <w:t>SQL</w:t>
@@ -2800,7 +2800,7 @@
               <w:rPr>
                 <w:rFonts w:ascii="Carlito" w:eastAsia="Carlito" w:hAnsi="Carlito"/>
                 <w:b/>
-                <w:color w:val="FFFFFF"/>
+                <w:color w:val="1C1C1C"/>
                 <w:sz w:val="18"/>
               </w:rPr>
               <w:t>Collection</w:t>
@@ -2833,7 +2833,7 @@
               <w:rPr>
                 <w:rFonts w:ascii="Carlito" w:eastAsia="Carlito" w:hAnsi="Carlito"/>
                 <w:b/>
-                <w:color w:val="FFFFFF"/>
+                <w:color w:val="1C1C1C"/>
                 <w:sz w:val="18"/>
               </w:rPr>
               <w:t>Number of Documents</w:t>
@@ -2986,7 +2986,7 @@
               <w:rPr>
                 <w:rFonts w:ascii="Carlito" w:eastAsia="Carlito" w:hAnsi="Carlito"/>
                 <w:b/>
-                <w:color w:val="FFFFFF"/>
+                <w:color w:val="1C1C1C"/>
                 <w:sz w:val="17"/>
               </w:rPr>
               <w:t>Question</w:t>
@@ -3019,7 +3019,7 @@
               <w:rPr>
                 <w:rFonts w:ascii="Carlito" w:eastAsia="Carlito" w:hAnsi="Carlito"/>
                 <w:b/>
-                <w:color w:val="FFFFFF"/>
+                <w:color w:val="1C1C1C"/>
                 <w:sz w:val="17"/>
               </w:rPr>
               <w:t>Mongo Command</w:t>
@@ -3052,7 +3052,7 @@
               <w:rPr>
                 <w:rFonts w:ascii="Carlito" w:eastAsia="Carlito" w:hAnsi="Carlito"/>
                 <w:b/>
-                <w:color w:val="FFFFFF"/>
+                <w:color w:val="1C1C1C"/>
                 <w:sz w:val="17"/>
               </w:rPr>
               <w:t>Result</w:t>
@@ -7212,7 +7212,7 @@
               <w:rPr>
                 <w:rFonts w:ascii="Carlito" w:eastAsia="Carlito" w:hAnsi="Carlito"/>
                 <w:b/>
-                <w:color w:val="FFFFFF"/>
+                <w:color w:val="1C1C1C"/>
                 <w:sz w:val="19"/>
               </w:rPr>
               <w:t>LoanID</w:t>
@@ -7246,7 +7246,7 @@
               <w:rPr>
                 <w:rFonts w:ascii="Carlito" w:eastAsia="Carlito" w:hAnsi="Carlito"/>
                 <w:b/>
-                <w:color w:val="FFFFFF"/>
+                <w:color w:val="1C1C1C"/>
                 <w:sz w:val="19"/>
               </w:rPr>
               <w:t>Source state</w:t>
@@ -7280,7 +7280,7 @@
               <w:rPr>
                 <w:rFonts w:ascii="Carlito" w:eastAsia="Carlito" w:hAnsi="Carlito"/>
                 <w:b/>
-                <w:color w:val="FFFFFF"/>
+                <w:color w:val="1C1C1C"/>
                 <w:sz w:val="19"/>
               </w:rPr>
               <w:t>UpdatedAt</w:t>
@@ -7314,7 +7314,7 @@
               <w:rPr>
                 <w:rFonts w:ascii="Carlito" w:eastAsia="Carlito" w:hAnsi="Carlito"/>
                 <w:b/>
-                <w:color w:val="FFFFFF"/>
+                <w:color w:val="1C1C1C"/>
                 <w:sz w:val="19"/>
               </w:rPr>
               <w:t xml:space="preserve">Target before </w:t>
@@ -7324,7 +7324,7 @@
               <w:rPr>
                 <w:rFonts w:ascii="Carlito" w:eastAsia="Carlito" w:hAnsi="Carlito"/>
                 <w:b/>
-                <w:color w:val="FFFFFF"/>
+                <w:color w:val="1C1C1C"/>
                 <w:sz w:val="19"/>
               </w:rPr>
               <w:t>run</w:t>
@@ -7787,7 +7787,7 @@
               <w:rPr>
                 <w:rFonts w:ascii="Carlito" w:eastAsia="Carlito" w:hAnsi="Carlito"/>
                 <w:b/>
-                <w:color w:val="FFFFFF"/>
+                <w:color w:val="1C1C1C"/>
                 <w:sz w:val="19"/>
               </w:rPr>
               <w:t>Test</w:t>
@@ -7820,7 +7820,7 @@
               <w:rPr>
                 <w:rFonts w:ascii="Carlito" w:eastAsia="Carlito" w:hAnsi="Carlito"/>
                 <w:b/>
-                <w:color w:val="FFFFFF"/>
+                <w:color w:val="1C1C1C"/>
                 <w:sz w:val="19"/>
               </w:rPr>
               <w:t>Rows staged</w:t>
@@ -7853,7 +7853,7 @@
               <w:rPr>
                 <w:rFonts w:ascii="Carlito" w:eastAsia="Carlito" w:hAnsi="Carlito"/>
                 <w:b/>
-                <w:color w:val="FFFFFF"/>
+                <w:color w:val="1C1C1C"/>
                 <w:sz w:val="19"/>
               </w:rPr>
               <w:t>Target rows</w:t>
@@ -7886,7 +7886,7 @@
               <w:rPr>
                 <w:rFonts w:ascii="Carlito" w:eastAsia="Carlito" w:hAnsi="Carlito"/>
                 <w:b/>
-                <w:color w:val="FFFFFF"/>
+                <w:color w:val="1C1C1C"/>
                 <w:sz w:val="19"/>
               </w:rPr>
               <w:t>Loan 7003</w:t>
@@ -7919,7 +7919,7 @@
               <w:rPr>
                 <w:rFonts w:ascii="Carlito" w:eastAsia="Carlito" w:hAnsi="Carlito"/>
                 <w:b/>
-                <w:color w:val="FFFFFF"/>
+                <w:color w:val="1C1C1C"/>
                 <w:sz w:val="19"/>
               </w:rPr>
               <w:t>Watermark</w:t>
@@ -8327,7 +8327,7 @@
               <w:rPr>
                 <w:rFonts w:ascii="Carlito" w:eastAsia="Carlito" w:hAnsi="Carlito"/>
                 <w:b/>
-                <w:color w:val="FFFFFF"/>
+                <w:color w:val="1C1C1C"/>
                 <w:sz w:val="19"/>
               </w:rPr>
               <w:t>Failure point</w:t>
@@ -8360,7 +8360,7 @@
               <w:rPr>
                 <w:rFonts w:ascii="Carlito" w:eastAsia="Carlito" w:hAnsi="Carlito"/>
                 <w:b/>
-                <w:color w:val="FFFFFF"/>
+                <w:color w:val="1C1C1C"/>
                 <w:sz w:val="19"/>
               </w:rPr>
               <w:t>Expected recovery</w:t>

</xml_diff>